<commit_message>
Docs: chen anh dashboard Grafana (tong quan + chi tiet latency) vao 2 file huong dan
</commit_message>
<xml_diff>
--- a/docs/Huong-Dan-Cai-Dat-Thu-Cong.docx
+++ b/docs/Huong-Dan-Cai-Dat-Thu-Cong.docx
@@ -2920,6 +2920,130 @@
       </w:pPr>
       <w:r>
         <w:t xml:space="preserve">vSAN Disk Health: congestion, dung lượng, health từng disk.</w:t>
+      </w:r>
+    </w:p>
+    <w:p>
+      <w:pPr>
+        <w:spacing w:after="20" w:before="120"/>
+        <w:jc w:val="center"/>
+      </w:pPr>
+      <w:r>
+        <w:drawing>
+          <wp:inline distT="0" distB="0" distL="0" distR="0">
+            <wp:extent cx="5943600" cy="2828925"/>
+            <wp:effectExtent t="0" r="0" b="0" l="0"/>
+            <wp:docPr id="1" name=""/>
+            <wp:cNvGraphicFramePr>
+              <a:graphicFrameLocks xmlns:a="http://schemas.openxmlformats.org/drawingml/2006/main" noChangeAspect="1"/>
+            </wp:cNvGraphicFramePr>
+            <a:graphic xmlns:a="http://schemas.openxmlformats.org/drawingml/2006/main">
+              <a:graphicData uri="http://schemas.openxmlformats.org/drawingml/2006/picture">
+                <pic:pic xmlns:pic="http://schemas.openxmlformats.org/drawingml/2006/picture">
+                  <pic:nvPicPr>
+                    <pic:cNvPr id="0" name="" descr=""/>
+                    <pic:cNvPicPr>
+                      <a:picLocks noChangeAspect="1" noChangeArrowheads="1"/>
+                    </pic:cNvPicPr>
+                  </pic:nvPicPr>
+                  <pic:blipFill>
+                    <a:blip r:embed="rId7" cstate="none"/>
+                    <a:srcRect/>
+                    <a:stretch>
+                      <a:fillRect/>
+                    </a:stretch>
+                  </pic:blipFill>
+                  <pic:spPr bwMode="auto">
+                    <a:xfrm>
+                      <a:off x="0" y="0"/>
+                      <a:ext cx="5943600" cy="2828925"/>
+                    </a:xfrm>
+                    <a:prstGeom prst="rect">
+                      <a:avLst/>
+                    </a:prstGeom>
+                  </pic:spPr>
+                </pic:pic>
+              </a:graphicData>
+            </a:graphic>
+          </wp:inline>
+        </w:drawing>
+      </w:r>
+    </w:p>
+    <w:p>
+      <w:pPr>
+        <w:spacing w:after="160"/>
+        <w:jc w:val="center"/>
+      </w:pPr>
+      <w:r>
+        <w:rPr>
+          <w:i/>
+          <w:iCs/>
+          <w:color w:val="666666"/>
+          <w:sz w:val="18"/>
+          <w:szCs w:val="18"/>
+        </w:rPr>
+        <w:t xml:space="preserve">Hình 1 — Tổng quan: 8 ô trạng thái + bảng host (Cluster POOL18-XD).</w:t>
+      </w:r>
+    </w:p>
+    <w:p>
+      <w:pPr>
+        <w:spacing w:after="20" w:before="120"/>
+        <w:jc w:val="center"/>
+      </w:pPr>
+      <w:r>
+        <w:drawing>
+          <wp:inline distT="0" distB="0" distL="0" distR="0">
+            <wp:extent cx="5943600" cy="2828925"/>
+            <wp:effectExtent t="0" r="0" b="0" l="0"/>
+            <wp:docPr id="2" name=""/>
+            <wp:cNvGraphicFramePr>
+              <a:graphicFrameLocks xmlns:a="http://schemas.openxmlformats.org/drawingml/2006/main" noChangeAspect="1"/>
+            </wp:cNvGraphicFramePr>
+            <a:graphic xmlns:a="http://schemas.openxmlformats.org/drawingml/2006/main">
+              <a:graphicData uri="http://schemas.openxmlformats.org/drawingml/2006/picture">
+                <pic:pic xmlns:pic="http://schemas.openxmlformats.org/drawingml/2006/picture">
+                  <pic:nvPicPr>
+                    <pic:cNvPr id="0" name="" descr=""/>
+                    <pic:cNvPicPr>
+                      <a:picLocks noChangeAspect="1" noChangeArrowheads="1"/>
+                    </pic:cNvPicPr>
+                  </pic:nvPicPr>
+                  <pic:blipFill>
+                    <a:blip r:embed="rId8" cstate="none"/>
+                    <a:srcRect/>
+                    <a:stretch>
+                      <a:fillRect/>
+                    </a:stretch>
+                  </pic:blipFill>
+                  <pic:spPr bwMode="auto">
+                    <a:xfrm>
+                      <a:off x="0" y="0"/>
+                      <a:ext cx="5943600" cy="2828925"/>
+                    </a:xfrm>
+                    <a:prstGeom prst="rect">
+                      <a:avLst/>
+                    </a:prstGeom>
+                  </pic:spPr>
+                </pic:pic>
+              </a:graphicData>
+            </a:graphic>
+          </wp:inline>
+        </w:drawing>
+      </w:r>
+    </w:p>
+    <w:p>
+      <w:pPr>
+        <w:spacing w:after="160"/>
+        <w:jc w:val="center"/>
+      </w:pPr>
+      <w:r>
+        <w:rPr>
+          <w:i/>
+          <w:iCs/>
+          <w:color w:val="666666"/>
+          <w:sz w:val="18"/>
+          <w:szCs w:val="18"/>
+        </w:rPr>
+        <w:t xml:space="preserve">Hình 2 — Chi tiết latency (write / read / network) và vSAN Disk Health.</w:t>
       </w:r>
     </w:p>
     <w:p>

</xml_diff>

<commit_message>
Docs: chen them 2 anh Grafana (vmnic bandwidth + CPU top 10) vao 2 file huong dan
</commit_message>
<xml_diff>
--- a/docs/Huong-Dan-Cai-Dat-Thu-Cong.docx
+++ b/docs/Huong-Dan-Cai-Dat-Thu-Cong.docx
@@ -3044,6 +3044,130 @@
           <w:szCs w:val="18"/>
         </w:rPr>
         <w:t xml:space="preserve">Hình 2 — Chi tiết latency (write / read / network) và vSAN Disk Health.</w:t>
+      </w:r>
+    </w:p>
+    <w:p>
+      <w:pPr>
+        <w:spacing w:after="20" w:before="120"/>
+        <w:jc w:val="center"/>
+      </w:pPr>
+      <w:r>
+        <w:drawing>
+          <wp:inline distT="0" distB="0" distL="0" distR="0">
+            <wp:extent cx="5943600" cy="2828925"/>
+            <wp:effectExtent t="0" r="0" b="0" l="0"/>
+            <wp:docPr id="3" name=""/>
+            <wp:cNvGraphicFramePr>
+              <a:graphicFrameLocks xmlns:a="http://schemas.openxmlformats.org/drawingml/2006/main" noChangeAspect="1"/>
+            </wp:cNvGraphicFramePr>
+            <a:graphic xmlns:a="http://schemas.openxmlformats.org/drawingml/2006/main">
+              <a:graphicData uri="http://schemas.openxmlformats.org/drawingml/2006/picture">
+                <pic:pic xmlns:pic="http://schemas.openxmlformats.org/drawingml/2006/picture">
+                  <pic:nvPicPr>
+                    <pic:cNvPr id="0" name="" descr=""/>
+                    <pic:cNvPicPr>
+                      <a:picLocks noChangeAspect="1" noChangeArrowheads="1"/>
+                    </pic:cNvPicPr>
+                  </pic:nvPicPr>
+                  <pic:blipFill>
+                    <a:blip r:embed="rId9" cstate="none"/>
+                    <a:srcRect/>
+                    <a:stretch>
+                      <a:fillRect/>
+                    </a:stretch>
+                  </pic:blipFill>
+                  <pic:spPr bwMode="auto">
+                    <a:xfrm>
+                      <a:off x="0" y="0"/>
+                      <a:ext cx="5943600" cy="2828925"/>
+                    </a:xfrm>
+                    <a:prstGeom prst="rect">
+                      <a:avLst/>
+                    </a:prstGeom>
+                  </pic:spPr>
+                </pic:pic>
+              </a:graphicData>
+            </a:graphic>
+          </wp:inline>
+        </w:drawing>
+      </w:r>
+    </w:p>
+    <w:p>
+      <w:pPr>
+        <w:spacing w:after="160"/>
+        <w:jc w:val="center"/>
+      </w:pPr>
+      <w:r>
+        <w:rPr>
+          <w:i/>
+          <w:iCs/>
+          <w:color w:val="666666"/>
+          <w:sz w:val="18"/>
+          <w:szCs w:val="18"/>
+        </w:rPr>
+        <w:t xml:space="preserve">Hình 3 — vmnic Bandwidth TX top 10 host (phần Network).</w:t>
+      </w:r>
+    </w:p>
+    <w:p>
+      <w:pPr>
+        <w:spacing w:after="20" w:before="120"/>
+        <w:jc w:val="center"/>
+      </w:pPr>
+      <w:r>
+        <w:drawing>
+          <wp:inline distT="0" distB="0" distL="0" distR="0">
+            <wp:extent cx="5943600" cy="2828925"/>
+            <wp:effectExtent t="0" r="0" b="0" l="0"/>
+            <wp:docPr id="4" name=""/>
+            <wp:cNvGraphicFramePr>
+              <a:graphicFrameLocks xmlns:a="http://schemas.openxmlformats.org/drawingml/2006/main" noChangeAspect="1"/>
+            </wp:cNvGraphicFramePr>
+            <a:graphic xmlns:a="http://schemas.openxmlformats.org/drawingml/2006/main">
+              <a:graphicData uri="http://schemas.openxmlformats.org/drawingml/2006/picture">
+                <pic:pic xmlns:pic="http://schemas.openxmlformats.org/drawingml/2006/picture">
+                  <pic:nvPicPr>
+                    <pic:cNvPr id="0" name="" descr=""/>
+                    <pic:cNvPicPr>
+                      <a:picLocks noChangeAspect="1" noChangeArrowheads="1"/>
+                    </pic:cNvPicPr>
+                  </pic:nvPicPr>
+                  <pic:blipFill>
+                    <a:blip r:embed="rId10" cstate="none"/>
+                    <a:srcRect/>
+                    <a:stretch>
+                      <a:fillRect/>
+                    </a:stretch>
+                  </pic:blipFill>
+                  <pic:spPr bwMode="auto">
+                    <a:xfrm>
+                      <a:off x="0" y="0"/>
+                      <a:ext cx="5943600" cy="2828925"/>
+                    </a:xfrm>
+                    <a:prstGeom prst="rect">
+                      <a:avLst/>
+                    </a:prstGeom>
+                  </pic:spPr>
+                </pic:pic>
+              </a:graphicData>
+            </a:graphic>
+          </wp:inline>
+        </w:drawing>
+      </w:r>
+    </w:p>
+    <w:p>
+      <w:pPr>
+        <w:spacing w:after="160"/>
+        <w:jc w:val="center"/>
+      </w:pPr>
+      <w:r>
+        <w:rPr>
+          <w:i/>
+          <w:iCs/>
+          <w:color w:val="666666"/>
+          <w:sz w:val="18"/>
+          <w:szCs w:val="18"/>
+        </w:rPr>
+        <w:t xml:space="preserve">Hình 4 — CPU (%) top 10 host (đường ngưỡng 60% / 90%).</w:t>
       </w:r>
     </w:p>
     <w:p>

</xml_diff>

<commit_message>
Docs: bo sung du 9 anh Grafana (CPU/RAM/Write/Read/Network latency, vmnic, vmk drop, dung luong, tong quan)
</commit_message>
<xml_diff>
--- a/docs/Huong-Dan-Cai-Dat-Thu-Cong.docx
+++ b/docs/Huong-Dan-Cai-Dat-Thu-Cong.docx
@@ -3043,7 +3043,7 @@
           <w:sz w:val="18"/>
           <w:szCs w:val="18"/>
         </w:rPr>
-        <w:t xml:space="preserve">Hình 2 — Chi tiết latency (write / read / network) và vSAN Disk Health.</w:t>
+        <w:t xml:space="preserve">Hình 2 — CPU (%) top 10 host (ngưỡng 60% / 90%).</w:t>
       </w:r>
     </w:p>
     <w:p>
@@ -3105,7 +3105,7 @@
           <w:sz w:val="18"/>
           <w:szCs w:val="18"/>
         </w:rPr>
-        <w:t xml:space="preserve">Hình 3 — vmnic Bandwidth TX top 10 host (phần Network).</w:t>
+        <w:t xml:space="preserve">Hình 3 — RAM (%) top 10 host (ngưỡng 60% / 90%).</w:t>
       </w:r>
     </w:p>
     <w:p>
@@ -3167,7 +3167,317 @@
           <w:sz w:val="18"/>
           <w:szCs w:val="18"/>
         </w:rPr>
-        <w:t xml:space="preserve">Hình 4 — CPU (%) top 10 host (đường ngưỡng 60% / 90%).</w:t>
+        <w:t xml:space="preserve">Hình 4 — vSAN Write latency top 10 host (ngưỡng 15ms).</w:t>
+      </w:r>
+    </w:p>
+    <w:p>
+      <w:pPr>
+        <w:spacing w:after="20" w:before="120"/>
+        <w:jc w:val="center"/>
+      </w:pPr>
+      <w:r>
+        <w:drawing>
+          <wp:inline distT="0" distB="0" distL="0" distR="0">
+            <wp:extent cx="5943600" cy="2828925"/>
+            <wp:effectExtent t="0" r="0" b="0" l="0"/>
+            <wp:docPr id="5" name=""/>
+            <wp:cNvGraphicFramePr>
+              <a:graphicFrameLocks xmlns:a="http://schemas.openxmlformats.org/drawingml/2006/main" noChangeAspect="1"/>
+            </wp:cNvGraphicFramePr>
+            <a:graphic xmlns:a="http://schemas.openxmlformats.org/drawingml/2006/main">
+              <a:graphicData uri="http://schemas.openxmlformats.org/drawingml/2006/picture">
+                <pic:pic xmlns:pic="http://schemas.openxmlformats.org/drawingml/2006/picture">
+                  <pic:nvPicPr>
+                    <pic:cNvPr id="0" name="" descr=""/>
+                    <pic:cNvPicPr>
+                      <a:picLocks noChangeAspect="1" noChangeArrowheads="1"/>
+                    </pic:cNvPicPr>
+                  </pic:nvPicPr>
+                  <pic:blipFill>
+                    <a:blip r:embed="rId11" cstate="none"/>
+                    <a:srcRect/>
+                    <a:stretch>
+                      <a:fillRect/>
+                    </a:stretch>
+                  </pic:blipFill>
+                  <pic:spPr bwMode="auto">
+                    <a:xfrm>
+                      <a:off x="0" y="0"/>
+                      <a:ext cx="5943600" cy="2828925"/>
+                    </a:xfrm>
+                    <a:prstGeom prst="rect">
+                      <a:avLst/>
+                    </a:prstGeom>
+                  </pic:spPr>
+                </pic:pic>
+              </a:graphicData>
+            </a:graphic>
+          </wp:inline>
+        </w:drawing>
+      </w:r>
+    </w:p>
+    <w:p>
+      <w:pPr>
+        <w:spacing w:after="160"/>
+        <w:jc w:val="center"/>
+      </w:pPr>
+      <w:r>
+        <w:rPr>
+          <w:i/>
+          <w:iCs/>
+          <w:color w:val="666666"/>
+          <w:sz w:val="18"/>
+          <w:szCs w:val="18"/>
+        </w:rPr>
+        <w:t xml:space="preserve">Hình 5 — vSAN Read latency top 10 host.</w:t>
+      </w:r>
+    </w:p>
+    <w:p>
+      <w:pPr>
+        <w:spacing w:after="20" w:before="120"/>
+        <w:jc w:val="center"/>
+      </w:pPr>
+      <w:r>
+        <w:drawing>
+          <wp:inline distT="0" distB="0" distL="0" distR="0">
+            <wp:extent cx="5943600" cy="2828925"/>
+            <wp:effectExtent t="0" r="0" b="0" l="0"/>
+            <wp:docPr id="6" name=""/>
+            <wp:cNvGraphicFramePr>
+              <a:graphicFrameLocks xmlns:a="http://schemas.openxmlformats.org/drawingml/2006/main" noChangeAspect="1"/>
+            </wp:cNvGraphicFramePr>
+            <a:graphic xmlns:a="http://schemas.openxmlformats.org/drawingml/2006/main">
+              <a:graphicData uri="http://schemas.openxmlformats.org/drawingml/2006/picture">
+                <pic:pic xmlns:pic="http://schemas.openxmlformats.org/drawingml/2006/picture">
+                  <pic:nvPicPr>
+                    <pic:cNvPr id="0" name="" descr=""/>
+                    <pic:cNvPicPr>
+                      <a:picLocks noChangeAspect="1" noChangeArrowheads="1"/>
+                    </pic:cNvPicPr>
+                  </pic:nvPicPr>
+                  <pic:blipFill>
+                    <a:blip r:embed="rId12" cstate="none"/>
+                    <a:srcRect/>
+                    <a:stretch>
+                      <a:fillRect/>
+                    </a:stretch>
+                  </pic:blipFill>
+                  <pic:spPr bwMode="auto">
+                    <a:xfrm>
+                      <a:off x="0" y="0"/>
+                      <a:ext cx="5943600" cy="2828925"/>
+                    </a:xfrm>
+                    <a:prstGeom prst="rect">
+                      <a:avLst/>
+                    </a:prstGeom>
+                  </pic:spPr>
+                </pic:pic>
+              </a:graphicData>
+            </a:graphic>
+          </wp:inline>
+        </w:drawing>
+      </w:r>
+    </w:p>
+    <w:p>
+      <w:pPr>
+        <w:spacing w:after="160"/>
+        <w:jc w:val="center"/>
+      </w:pPr>
+      <w:r>
+        <w:rPr>
+          <w:i/>
+          <w:iCs/>
+          <w:color w:val="666666"/>
+          <w:sz w:val="18"/>
+          <w:szCs w:val="18"/>
+        </w:rPr>
+        <w:t xml:space="preserve">Hình 6 — vSAN Network latency (Max của cluster).</w:t>
+      </w:r>
+    </w:p>
+    <w:p>
+      <w:pPr>
+        <w:spacing w:after="20" w:before="120"/>
+        <w:jc w:val="center"/>
+      </w:pPr>
+      <w:r>
+        <w:drawing>
+          <wp:inline distT="0" distB="0" distL="0" distR="0">
+            <wp:extent cx="5943600" cy="2828925"/>
+            <wp:effectExtent t="0" r="0" b="0" l="0"/>
+            <wp:docPr id="7" name=""/>
+            <wp:cNvGraphicFramePr>
+              <a:graphicFrameLocks xmlns:a="http://schemas.openxmlformats.org/drawingml/2006/main" noChangeAspect="1"/>
+            </wp:cNvGraphicFramePr>
+            <a:graphic xmlns:a="http://schemas.openxmlformats.org/drawingml/2006/main">
+              <a:graphicData uri="http://schemas.openxmlformats.org/drawingml/2006/picture">
+                <pic:pic xmlns:pic="http://schemas.openxmlformats.org/drawingml/2006/picture">
+                  <pic:nvPicPr>
+                    <pic:cNvPr id="0" name="" descr=""/>
+                    <pic:cNvPicPr>
+                      <a:picLocks noChangeAspect="1" noChangeArrowheads="1"/>
+                    </pic:cNvPicPr>
+                  </pic:nvPicPr>
+                  <pic:blipFill>
+                    <a:blip r:embed="rId13" cstate="none"/>
+                    <a:srcRect/>
+                    <a:stretch>
+                      <a:fillRect/>
+                    </a:stretch>
+                  </pic:blipFill>
+                  <pic:spPr bwMode="auto">
+                    <a:xfrm>
+                      <a:off x="0" y="0"/>
+                      <a:ext cx="5943600" cy="2828925"/>
+                    </a:xfrm>
+                    <a:prstGeom prst="rect">
+                      <a:avLst/>
+                    </a:prstGeom>
+                  </pic:spPr>
+                </pic:pic>
+              </a:graphicData>
+            </a:graphic>
+          </wp:inline>
+        </w:drawing>
+      </w:r>
+    </w:p>
+    <w:p>
+      <w:pPr>
+        <w:spacing w:after="160"/>
+        <w:jc w:val="center"/>
+      </w:pPr>
+      <w:r>
+        <w:rPr>
+          <w:i/>
+          <w:iCs/>
+          <w:color w:val="666666"/>
+          <w:sz w:val="18"/>
+          <w:szCs w:val="18"/>
+        </w:rPr>
+        <w:t xml:space="preserve">Hình 7 — vmnic Bandwidth TX top 10 host.</w:t>
+      </w:r>
+    </w:p>
+    <w:p>
+      <w:pPr>
+        <w:spacing w:after="20" w:before="120"/>
+        <w:jc w:val="center"/>
+      </w:pPr>
+      <w:r>
+        <w:drawing>
+          <wp:inline distT="0" distB="0" distL="0" distR="0">
+            <wp:extent cx="5943600" cy="2828925"/>
+            <wp:effectExtent t="0" r="0" b="0" l="0"/>
+            <wp:docPr id="8" name=""/>
+            <wp:cNvGraphicFramePr>
+              <a:graphicFrameLocks xmlns:a="http://schemas.openxmlformats.org/drawingml/2006/main" noChangeAspect="1"/>
+            </wp:cNvGraphicFramePr>
+            <a:graphic xmlns:a="http://schemas.openxmlformats.org/drawingml/2006/main">
+              <a:graphicData uri="http://schemas.openxmlformats.org/drawingml/2006/picture">
+                <pic:pic xmlns:pic="http://schemas.openxmlformats.org/drawingml/2006/picture">
+                  <pic:nvPicPr>
+                    <pic:cNvPr id="0" name="" descr=""/>
+                    <pic:cNvPicPr>
+                      <a:picLocks noChangeAspect="1" noChangeArrowheads="1"/>
+                    </pic:cNvPicPr>
+                  </pic:nvPicPr>
+                  <pic:blipFill>
+                    <a:blip r:embed="rId14" cstate="none"/>
+                    <a:srcRect/>
+                    <a:stretch>
+                      <a:fillRect/>
+                    </a:stretch>
+                  </pic:blipFill>
+                  <pic:spPr bwMode="auto">
+                    <a:xfrm>
+                      <a:off x="0" y="0"/>
+                      <a:ext cx="5943600" cy="2828925"/>
+                    </a:xfrm>
+                    <a:prstGeom prst="rect">
+                      <a:avLst/>
+                    </a:prstGeom>
+                  </pic:spPr>
+                </pic:pic>
+              </a:graphicData>
+            </a:graphic>
+          </wp:inline>
+        </w:drawing>
+      </w:r>
+    </w:p>
+    <w:p>
+      <w:pPr>
+        <w:spacing w:after="160"/>
+        <w:jc w:val="center"/>
+      </w:pPr>
+      <w:r>
+        <w:rPr>
+          <w:i/>
+          <w:iCs/>
+          <w:color w:val="666666"/>
+          <w:sz w:val="18"/>
+          <w:szCs w:val="18"/>
+        </w:rPr>
+        <w:t xml:space="preserve">Hình 8 — vSAN vmk Packet Drop / Discard (ngưỡng 0,1%).</w:t>
+      </w:r>
+    </w:p>
+    <w:p>
+      <w:pPr>
+        <w:spacing w:after="20" w:before="120"/>
+        <w:jc w:val="center"/>
+      </w:pPr>
+      <w:r>
+        <w:drawing>
+          <wp:inline distT="0" distB="0" distL="0" distR="0">
+            <wp:extent cx="5943600" cy="2828925"/>
+            <wp:effectExtent t="0" r="0" b="0" l="0"/>
+            <wp:docPr id="9" name=""/>
+            <wp:cNvGraphicFramePr>
+              <a:graphicFrameLocks xmlns:a="http://schemas.openxmlformats.org/drawingml/2006/main" noChangeAspect="1"/>
+            </wp:cNvGraphicFramePr>
+            <a:graphic xmlns:a="http://schemas.openxmlformats.org/drawingml/2006/main">
+              <a:graphicData uri="http://schemas.openxmlformats.org/drawingml/2006/picture">
+                <pic:pic xmlns:pic="http://schemas.openxmlformats.org/drawingml/2006/picture">
+                  <pic:nvPicPr>
+                    <pic:cNvPr id="0" name="" descr=""/>
+                    <pic:cNvPicPr>
+                      <a:picLocks noChangeAspect="1" noChangeArrowheads="1"/>
+                    </pic:cNvPicPr>
+                  </pic:nvPicPr>
+                  <pic:blipFill>
+                    <a:blip r:embed="rId15" cstate="none"/>
+                    <a:srcRect/>
+                    <a:stretch>
+                      <a:fillRect/>
+                    </a:stretch>
+                  </pic:blipFill>
+                  <pic:spPr bwMode="auto">
+                    <a:xfrm>
+                      <a:off x="0" y="0"/>
+                      <a:ext cx="5943600" cy="2828925"/>
+                    </a:xfrm>
+                    <a:prstGeom prst="rect">
+                      <a:avLst/>
+                    </a:prstGeom>
+                  </pic:spPr>
+                </pic:pic>
+              </a:graphicData>
+            </a:graphic>
+          </wp:inline>
+        </w:drawing>
+      </w:r>
+    </w:p>
+    <w:p>
+      <w:pPr>
+        <w:spacing w:after="160"/>
+        <w:jc w:val="center"/>
+      </w:pPr>
+      <w:r>
+        <w:rPr>
+          <w:i/>
+          <w:iCs/>
+          <w:color w:val="666666"/>
+          <w:sz w:val="18"/>
+          <w:szCs w:val="18"/>
+        </w:rPr>
+        <w:t xml:space="preserve">Hình 9 — Dung lượng đã dùng — top 10 disk vSAN.</w:t>
       </w:r>
     </w:p>
     <w:p>

</xml_diff>

<commit_message>
Docs: them anh vmnic RX + Congestion (du 11 anh Grafana - het panel dashboard)
</commit_message>
<xml_diff>
--- a/docs/Huong-Dan-Cai-Dat-Thu-Cong.docx
+++ b/docs/Huong-Dan-Cai-Dat-Thu-Cong.docx
@@ -3415,7 +3415,7 @@
           <w:sz w:val="18"/>
           <w:szCs w:val="18"/>
         </w:rPr>
-        <w:t xml:space="preserve">Hình 8 — vSAN vmk Packet Drop / Discard (ngưỡng 0,1%).</w:t>
+        <w:t xml:space="preserve">Hình 8 — vmnic Bandwidth RX top 10 host.</w:t>
       </w:r>
     </w:p>
     <w:p>
@@ -3477,7 +3477,131 @@
           <w:sz w:val="18"/>
           <w:szCs w:val="18"/>
         </w:rPr>
-        <w:t xml:space="preserve">Hình 9 — Dung lượng đã dùng — top 10 disk vSAN.</w:t>
+        <w:t xml:space="preserve">Hình 9 — vSAN vmk Packet Drop / Discard (ngưỡng 0,1%).</w:t>
+      </w:r>
+    </w:p>
+    <w:p>
+      <w:pPr>
+        <w:spacing w:after="20" w:before="120"/>
+        <w:jc w:val="center"/>
+      </w:pPr>
+      <w:r>
+        <w:drawing>
+          <wp:inline distT="0" distB="0" distL="0" distR="0">
+            <wp:extent cx="5943600" cy="2828925"/>
+            <wp:effectExtent t="0" r="0" b="0" l="0"/>
+            <wp:docPr id="10" name=""/>
+            <wp:cNvGraphicFramePr>
+              <a:graphicFrameLocks xmlns:a="http://schemas.openxmlformats.org/drawingml/2006/main" noChangeAspect="1"/>
+            </wp:cNvGraphicFramePr>
+            <a:graphic xmlns:a="http://schemas.openxmlformats.org/drawingml/2006/main">
+              <a:graphicData uri="http://schemas.openxmlformats.org/drawingml/2006/picture">
+                <pic:pic xmlns:pic="http://schemas.openxmlformats.org/drawingml/2006/picture">
+                  <pic:nvPicPr>
+                    <pic:cNvPr id="0" name="" descr=""/>
+                    <pic:cNvPicPr>
+                      <a:picLocks noChangeAspect="1" noChangeArrowheads="1"/>
+                    </pic:cNvPicPr>
+                  </pic:nvPicPr>
+                  <pic:blipFill>
+                    <a:blip r:embed="rId16" cstate="none"/>
+                    <a:srcRect/>
+                    <a:stretch>
+                      <a:fillRect/>
+                    </a:stretch>
+                  </pic:blipFill>
+                  <pic:spPr bwMode="auto">
+                    <a:xfrm>
+                      <a:off x="0" y="0"/>
+                      <a:ext cx="5943600" cy="2828925"/>
+                    </a:xfrm>
+                    <a:prstGeom prst="rect">
+                      <a:avLst/>
+                    </a:prstGeom>
+                  </pic:spPr>
+                </pic:pic>
+              </a:graphicData>
+            </a:graphic>
+          </wp:inline>
+        </w:drawing>
+      </w:r>
+    </w:p>
+    <w:p>
+      <w:pPr>
+        <w:spacing w:after="160"/>
+        <w:jc w:val="center"/>
+      </w:pPr>
+      <w:r>
+        <w:rPr>
+          <w:i/>
+          <w:iCs/>
+          <w:color w:val="666666"/>
+          <w:sz w:val="18"/>
+          <w:szCs w:val="18"/>
+        </w:rPr>
+        <w:t xml:space="preserve">Hình 10 — vSAN Congestion — top 10 disk (ngưỡng 60).</w:t>
+      </w:r>
+    </w:p>
+    <w:p>
+      <w:pPr>
+        <w:spacing w:after="20" w:before="120"/>
+        <w:jc w:val="center"/>
+      </w:pPr>
+      <w:r>
+        <w:drawing>
+          <wp:inline distT="0" distB="0" distL="0" distR="0">
+            <wp:extent cx="5943600" cy="2828925"/>
+            <wp:effectExtent t="0" r="0" b="0" l="0"/>
+            <wp:docPr id="11" name=""/>
+            <wp:cNvGraphicFramePr>
+              <a:graphicFrameLocks xmlns:a="http://schemas.openxmlformats.org/drawingml/2006/main" noChangeAspect="1"/>
+            </wp:cNvGraphicFramePr>
+            <a:graphic xmlns:a="http://schemas.openxmlformats.org/drawingml/2006/main">
+              <a:graphicData uri="http://schemas.openxmlformats.org/drawingml/2006/picture">
+                <pic:pic xmlns:pic="http://schemas.openxmlformats.org/drawingml/2006/picture">
+                  <pic:nvPicPr>
+                    <pic:cNvPr id="0" name="" descr=""/>
+                    <pic:cNvPicPr>
+                      <a:picLocks noChangeAspect="1" noChangeArrowheads="1"/>
+                    </pic:cNvPicPr>
+                  </pic:nvPicPr>
+                  <pic:blipFill>
+                    <a:blip r:embed="rId17" cstate="none"/>
+                    <a:srcRect/>
+                    <a:stretch>
+                      <a:fillRect/>
+                    </a:stretch>
+                  </pic:blipFill>
+                  <pic:spPr bwMode="auto">
+                    <a:xfrm>
+                      <a:off x="0" y="0"/>
+                      <a:ext cx="5943600" cy="2828925"/>
+                    </a:xfrm>
+                    <a:prstGeom prst="rect">
+                      <a:avLst/>
+                    </a:prstGeom>
+                  </pic:spPr>
+                </pic:pic>
+              </a:graphicData>
+            </a:graphic>
+          </wp:inline>
+        </w:drawing>
+      </w:r>
+    </w:p>
+    <w:p>
+      <w:pPr>
+        <w:spacing w:after="160"/>
+        <w:jc w:val="center"/>
+      </w:pPr>
+      <w:r>
+        <w:rPr>
+          <w:i/>
+          <w:iCs/>
+          <w:color w:val="666666"/>
+          <w:sz w:val="18"/>
+          <w:szCs w:val="18"/>
+        </w:rPr>
+        <w:t xml:space="preserve">Hình 11 — Dung lượng đã dùng — top 10 disk vSAN.</w:t>
       </w:r>
     </w:p>
     <w:p>

</xml_diff>

<commit_message>
Docs: chup lai 11 anh Grafana (POOL18-XD, 6 gio gan nhat, che do View panel), sinh lai 2 file huong dan Tu-Dong / Thu-Cong
</commit_message>
<xml_diff>
--- a/docs/Huong-Dan-Cai-Dat-Thu-Cong.docx
+++ b/docs/Huong-Dan-Cai-Dat-Thu-Cong.docx
@@ -2930,7 +2930,7 @@
       <w:r>
         <w:drawing>
           <wp:inline distT="0" distB="0" distL="0" distR="0">
-            <wp:extent cx="5943600" cy="2828925"/>
+            <wp:extent cx="5943600" cy="2695575"/>
             <wp:effectExtent t="0" r="0" b="0" l="0"/>
             <wp:docPr id="1" name=""/>
             <wp:cNvGraphicFramePr>
@@ -2955,7 +2955,7 @@
                   <pic:spPr bwMode="auto">
                     <a:xfrm>
                       <a:off x="0" y="0"/>
-                      <a:ext cx="5943600" cy="2828925"/>
+                      <a:ext cx="5943600" cy="2695575"/>
                     </a:xfrm>
                     <a:prstGeom prst="rect">
                       <a:avLst/>
@@ -2992,7 +2992,7 @@
       <w:r>
         <w:drawing>
           <wp:inline distT="0" distB="0" distL="0" distR="0">
-            <wp:extent cx="5943600" cy="2828925"/>
+            <wp:extent cx="5943600" cy="2695575"/>
             <wp:effectExtent t="0" r="0" b="0" l="0"/>
             <wp:docPr id="2" name=""/>
             <wp:cNvGraphicFramePr>
@@ -3017,7 +3017,7 @@
                   <pic:spPr bwMode="auto">
                     <a:xfrm>
                       <a:off x="0" y="0"/>
-                      <a:ext cx="5943600" cy="2828925"/>
+                      <a:ext cx="5943600" cy="2695575"/>
                     </a:xfrm>
                     <a:prstGeom prst="rect">
                       <a:avLst/>
@@ -3054,7 +3054,7 @@
       <w:r>
         <w:drawing>
           <wp:inline distT="0" distB="0" distL="0" distR="0">
-            <wp:extent cx="5943600" cy="2828925"/>
+            <wp:extent cx="5943600" cy="2695575"/>
             <wp:effectExtent t="0" r="0" b="0" l="0"/>
             <wp:docPr id="3" name=""/>
             <wp:cNvGraphicFramePr>
@@ -3079,7 +3079,7 @@
                   <pic:spPr bwMode="auto">
                     <a:xfrm>
                       <a:off x="0" y="0"/>
-                      <a:ext cx="5943600" cy="2828925"/>
+                      <a:ext cx="5943600" cy="2695575"/>
                     </a:xfrm>
                     <a:prstGeom prst="rect">
                       <a:avLst/>
@@ -3116,7 +3116,7 @@
       <w:r>
         <w:drawing>
           <wp:inline distT="0" distB="0" distL="0" distR="0">
-            <wp:extent cx="5943600" cy="2828925"/>
+            <wp:extent cx="5943600" cy="2695575"/>
             <wp:effectExtent t="0" r="0" b="0" l="0"/>
             <wp:docPr id="4" name=""/>
             <wp:cNvGraphicFramePr>
@@ -3141,7 +3141,7 @@
                   <pic:spPr bwMode="auto">
                     <a:xfrm>
                       <a:off x="0" y="0"/>
-                      <a:ext cx="5943600" cy="2828925"/>
+                      <a:ext cx="5943600" cy="2695575"/>
                     </a:xfrm>
                     <a:prstGeom prst="rect">
                       <a:avLst/>
@@ -3178,7 +3178,7 @@
       <w:r>
         <w:drawing>
           <wp:inline distT="0" distB="0" distL="0" distR="0">
-            <wp:extent cx="5943600" cy="2828925"/>
+            <wp:extent cx="5943600" cy="2695575"/>
             <wp:effectExtent t="0" r="0" b="0" l="0"/>
             <wp:docPr id="5" name=""/>
             <wp:cNvGraphicFramePr>
@@ -3203,7 +3203,7 @@
                   <pic:spPr bwMode="auto">
                     <a:xfrm>
                       <a:off x="0" y="0"/>
-                      <a:ext cx="5943600" cy="2828925"/>
+                      <a:ext cx="5943600" cy="2695575"/>
                     </a:xfrm>
                     <a:prstGeom prst="rect">
                       <a:avLst/>
@@ -3240,7 +3240,7 @@
       <w:r>
         <w:drawing>
           <wp:inline distT="0" distB="0" distL="0" distR="0">
-            <wp:extent cx="5943600" cy="2828925"/>
+            <wp:extent cx="5943600" cy="2695575"/>
             <wp:effectExtent t="0" r="0" b="0" l="0"/>
             <wp:docPr id="6" name=""/>
             <wp:cNvGraphicFramePr>
@@ -3265,7 +3265,7 @@
                   <pic:spPr bwMode="auto">
                     <a:xfrm>
                       <a:off x="0" y="0"/>
-                      <a:ext cx="5943600" cy="2828925"/>
+                      <a:ext cx="5943600" cy="2695575"/>
                     </a:xfrm>
                     <a:prstGeom prst="rect">
                       <a:avLst/>
@@ -3302,7 +3302,7 @@
       <w:r>
         <w:drawing>
           <wp:inline distT="0" distB="0" distL="0" distR="0">
-            <wp:extent cx="5943600" cy="2828925"/>
+            <wp:extent cx="5943600" cy="2695575"/>
             <wp:effectExtent t="0" r="0" b="0" l="0"/>
             <wp:docPr id="7" name=""/>
             <wp:cNvGraphicFramePr>
@@ -3327,7 +3327,7 @@
                   <pic:spPr bwMode="auto">
                     <a:xfrm>
                       <a:off x="0" y="0"/>
-                      <a:ext cx="5943600" cy="2828925"/>
+                      <a:ext cx="5943600" cy="2695575"/>
                     </a:xfrm>
                     <a:prstGeom prst="rect">
                       <a:avLst/>
@@ -3364,7 +3364,7 @@
       <w:r>
         <w:drawing>
           <wp:inline distT="0" distB="0" distL="0" distR="0">
-            <wp:extent cx="5943600" cy="2828925"/>
+            <wp:extent cx="5943600" cy="2695575"/>
             <wp:effectExtent t="0" r="0" b="0" l="0"/>
             <wp:docPr id="8" name=""/>
             <wp:cNvGraphicFramePr>
@@ -3389,7 +3389,7 @@
                   <pic:spPr bwMode="auto">
                     <a:xfrm>
                       <a:off x="0" y="0"/>
-                      <a:ext cx="5943600" cy="2828925"/>
+                      <a:ext cx="5943600" cy="2695575"/>
                     </a:xfrm>
                     <a:prstGeom prst="rect">
                       <a:avLst/>
@@ -3426,7 +3426,7 @@
       <w:r>
         <w:drawing>
           <wp:inline distT="0" distB="0" distL="0" distR="0">
-            <wp:extent cx="5943600" cy="2828925"/>
+            <wp:extent cx="5943600" cy="2695575"/>
             <wp:effectExtent t="0" r="0" b="0" l="0"/>
             <wp:docPr id="9" name=""/>
             <wp:cNvGraphicFramePr>
@@ -3451,7 +3451,7 @@
                   <pic:spPr bwMode="auto">
                     <a:xfrm>
                       <a:off x="0" y="0"/>
-                      <a:ext cx="5943600" cy="2828925"/>
+                      <a:ext cx="5943600" cy="2695575"/>
                     </a:xfrm>
                     <a:prstGeom prst="rect">
                       <a:avLst/>
@@ -3488,7 +3488,7 @@
       <w:r>
         <w:drawing>
           <wp:inline distT="0" distB="0" distL="0" distR="0">
-            <wp:extent cx="5943600" cy="2828925"/>
+            <wp:extent cx="5943600" cy="2695575"/>
             <wp:effectExtent t="0" r="0" b="0" l="0"/>
             <wp:docPr id="10" name=""/>
             <wp:cNvGraphicFramePr>
@@ -3513,7 +3513,7 @@
                   <pic:spPr bwMode="auto">
                     <a:xfrm>
                       <a:off x="0" y="0"/>
-                      <a:ext cx="5943600" cy="2828925"/>
+                      <a:ext cx="5943600" cy="2695575"/>
                     </a:xfrm>
                     <a:prstGeom prst="rect">
                       <a:avLst/>
@@ -3550,7 +3550,7 @@
       <w:r>
         <w:drawing>
           <wp:inline distT="0" distB="0" distL="0" distR="0">
-            <wp:extent cx="5943600" cy="2828925"/>
+            <wp:extent cx="5943600" cy="2695575"/>
             <wp:effectExtent t="0" r="0" b="0" l="0"/>
             <wp:docPr id="11" name=""/>
             <wp:cNvGraphicFramePr>
@@ -3575,7 +3575,7 @@
                   <pic:spPr bwMode="auto">
                     <a:xfrm>
                       <a:off x="0" y="0"/>
-                      <a:ext cx="5943600" cy="2828925"/>
+                      <a:ext cx="5943600" cy="2695575"/>
                     </a:xfrm>
                     <a:prstGeom prst="rect">
                       <a:avLst/>

</xml_diff>